<commit_message>
Clarify gold trajectories, anti-patterns, and Type C deferral in framework docs.
Documents RL optimization signals and layer-scored anti-patterns for engineers while keeping the senior brief high-level; explains v0.5 Type C deferral due to market data licensing.

Co-authored-by: Cursor <cursoragent@cursor.com>
</commit_message>
<xml_diff>
--- a/docs/export/ZSTATE_Complete_Framework_185_Tasks.docx
+++ b/docs/export/ZSTATE_Complete_Framework_185_Tasks.docx
@@ -494,7 +494,7 @@
           </w:tcPr>
           <w:p>
             <w:r>
-              <w:t>Full initiation (v0.5)</w:t>
+              <w:t>Full initiation (v0.5 — deferred: market data APIs)</w:t>
             </w:r>
           </w:p>
         </w:tc>
@@ -696,7 +696,25 @@
         <w:pStyle w:val="Heading1"/>
       </w:pPr>
       <w:r>
-        <w:t>5. MVD Pilot — 15 Tasks</w:t>
+        <w:t>5. Gold Trajectories &amp; Anti-Patterns</w:t>
+      </w:r>
+    </w:p>
+    <w:p>
+      <w:r>
+        <w:t>Gold trajectories use a minimal section set (not brittle tool sequences). The gold trajectory acts as a multi-objective optimization signal for reinforcement learning (RL), specifically rewarding path efficiency and section recall accuracy.</w:t>
+      </w:r>
+    </w:p>
+    <w:p>
+      <w:r>
+        <w:t>Anti-patterns (required in every gold path JSON): Expert-defined negative signals for the reward model — e.g., load_entire_10k (path bloat), skip_accounting_policies_note (section recall failure), produce_buy_hold_sell_recommendation on Type F tasks.</w:t>
+      </w:r>
+    </w:p>
+    <w:p>
+      <w:pPr>
+        <w:pStyle w:val="Heading1"/>
+      </w:pPr>
+      <w:r>
+        <w:t>6. MVD Pilot — 15 Tasks</w:t>
       </w:r>
     </w:p>
     <w:tbl>
@@ -1390,7 +1408,7 @@
         <w:pStyle w:val="Heading1"/>
       </w:pPr>
       <w:r>
-        <w:t>6. Full Task Catalog — 185 Tasks (Detailed)</w:t>
+        <w:t>7. Full Task Catalog — 185 Tasks (Detailed)</w:t>
       </w:r>
     </w:p>
     <w:p>
@@ -9486,7 +9504,7 @@
         <w:pStyle w:val="Heading1"/>
       </w:pPr>
       <w:r>
-        <w:t>7. Roadmap to Full Catalog</w:t>
+        <w:t>8. Roadmap to Full Catalog</w:t>
       </w:r>
     </w:p>
     <w:tbl>
@@ -9719,7 +9737,7 @@
           </w:tcPr>
           <w:p>
             <w:r>
-              <w:t>Type C full initiation</w:t>
+              <w:t>Type C full initiation (Bloomberg/Refinitiv + FINRA)</w:t>
             </w:r>
           </w:p>
         </w:tc>

</xml_diff>